<commit_message>
changed volatility to Roger Satchell
</commit_message>
<xml_diff>
--- a/Docs/Do_Stable_Coins_Predict_Cryptos_New.docx
+++ b/Docs/Do_Stable_Coins_Predict_Cryptos_New.docx
@@ -402,16 +402,42 @@
         <w:pStyle w:val="Heading2"/>
       </w:pPr>
       <w:r>
+        <w:t xml:space="preserve">1.2 </w:t>
+      </w:r>
+      <w:proofErr w:type="gramStart"/>
+      <w:r>
+        <w:t>Principle</w:t>
+      </w:r>
+      <w:proofErr w:type="gramEnd"/>
+      <w:r>
+        <w:t xml:space="preserve"> Component Analysis (PCA)</w:t>
+      </w:r>
+    </w:p>
+    <w:p>
+      <w:r>
+        <w:t>TALK ABOUT THE LOADINGS AND HOW THEY ARE ALL EQUAL</w:t>
+      </w:r>
+    </w:p>
+    <w:p>
+      <w:r>
         <w:lastRenderedPageBreak/>
-        <w:t xml:space="preserve">1.2 </w:t>
-      </w:r>
-      <w:proofErr w:type="gramStart"/>
-      <w:r>
-        <w:t>Principle</w:t>
-      </w:r>
-      <w:proofErr w:type="gramEnd"/>
-      <w:r>
-        <w:t xml:space="preserve"> Component Analysis (PCA)</w:t>
+        <w:t>“</w:t>
+      </w:r>
+      <w:r>
+        <w:t xml:space="preserve">This confirms a </w:t>
+      </w:r>
+      <w:r>
+        <w:rPr>
+          <w:b/>
+          <w:bCs/>
+        </w:rPr>
+        <w:t>strong systemic "Beta"</w:t>
+      </w:r>
+      <w:r>
+        <w:t>. A "Crypto Market Factor" exists, and BNB, BTC, ETH, and XRP are all equally exposed to it. No single coin is driving the bus; the market moves as a herd.</w:t>
+      </w:r>
+      <w:r>
+        <w:t>”</w:t>
       </w:r>
     </w:p>
     <w:p>
@@ -3080,7 +3106,6 @@
   <w:style w:type="character" w:default="1" w:styleId="DefaultParagraphFont">
     <w:name w:val="Default Paragraph Font"/>
     <w:uiPriority w:val="1"/>
-    <w:semiHidden/>
     <w:unhideWhenUsed/>
   </w:style>
   <w:style w:type="table" w:default="1" w:styleId="TableNormal">

</xml_diff>